<commit_message>
Update all documents: SSIS architecture, version fixes, add companion docs
</commit_message>
<xml_diff>
--- a/benchmarks/Benchmarks_Verification.docx
+++ b/benchmarks/Benchmarks_Verification.docx
@@ -1282,40 +1282,7 @@
           <w:sz w:val="18"/>
           <w:szCs w:val="18"/>
         </w:rPr>
-        <w:t xml:space="preserve">Figure 1: ETL Batch Summary and Layer Breakdown (SSMS)</w:t>
-      </w:r>
-      <w:r>
-        <w:drawing>
-          <wp:inline distT="0" distB="0" distL="0" distR="0">
-            <wp:extent cx="5029200" cy="2308209"/>
-            <wp:docPr id="1" name="Screenshot_BatchStep"/>
-            <a:graphic xmlns:a="http://schemas.openxmlformats.org/drawingml/2006/main">
-              <a:graphicData uri="http://schemas.openxmlformats.org/drawingml/2006/picture">
-                <pic:pic xmlns:pic="http://schemas.openxmlformats.org/drawingml/2006/picture">
-                  <pic:nvPicPr>
-                    <pic:cNvPr id="1" name="image_batch_step.png"/>
-                    <pic:cNvPicPr/>
-                  </pic:nvPicPr>
-                  <pic:blipFill>
-                    <a:blip r:embed="rId20"/>
-                    <a:stretch>
-                      <a:fillRect/>
-                    </a:stretch>
-                  </pic:blipFill>
-                  <pic:spPr>
-                    <a:xfrm>
-                      <a:off x="0" y="0"/>
-                      <a:ext cx="5029200" cy="2308209"/>
-                    </a:xfrm>
-                    <a:prstGeom prst="rect">
-                      <a:avLst/>
-                    </a:prstGeom>
-                  </pic:spPr>
-                </pic:pic>
-              </a:graphicData>
-            </a:graphic>
-          </wp:inline>
-        </w:drawing>
+        <w:t xml:space="preserve">[Paste SSMS screenshot here]</w:t>
       </w:r>
     </w:p>
     <w:p>
@@ -1850,7 +1817,7 @@
           <w:sz w:val="18"/>
           <w:szCs w:val="18"/>
         </w:rPr>
-        <w:t xml:space="preserve">[See Figure 1 above — screenshot includes both batch and step-level results]</w:t>
+        <w:t xml:space="preserve">[Paste SSMS screenshot here]</w:t>
       </w:r>
     </w:p>
     <w:p>
@@ -2145,91 +2112,7 @@
           <w:sz w:val="18"/>
           <w:szCs w:val="18"/>
         </w:rPr>
-        <w:t xml:space="preserve">Figure 2a: All 49 ETL Steps — Steps 1–39 (SSMS)</w:t>
-      </w:r>
-      <w:r>
-        <w:drawing>
-          <wp:inline distT="0" distB="0" distL="0" distR="0">
-            <wp:extent cx="5029200" cy="4770259"/>
-            <wp:docPr id="2" name="Steps_1_39"/>
-            <a:graphic xmlns:a="http://schemas.openxmlformats.org/drawingml/2006/main">
-              <a:graphicData uri="http://schemas.openxmlformats.org/drawingml/2006/picture">
-                <pic:pic xmlns:pic="http://schemas.openxmlformats.org/drawingml/2006/picture">
-                  <pic:nvPicPr>
-                    <pic:cNvPr id="2" name="Steps_1_39"/>
-                    <pic:cNvPicPr/>
-                  </pic:nvPicPr>
-                  <pic:blipFill>
-                    <a:blip r:embed="rId21"/>
-                    <a:stretch>
-                      <a:fillRect/>
-                    </a:stretch>
-                  </pic:blipFill>
-                  <pic:spPr>
-                    <a:xfrm>
-                      <a:off x="0" y="0"/>
-                      <a:ext cx="5029200" cy="4770259"/>
-                    </a:xfrm>
-                    <a:prstGeom prst="rect">
-                      <a:avLst/>
-                    </a:prstGeom>
-                  </pic:spPr>
-                </pic:pic>
-              </a:graphicData>
-            </a:graphic>
-          </wp:inline>
-        </w:drawing>
-      </w:r>
-    </w:p>
-    <w:p>
-      <w:pPr>
-        <w:shd w:fill="F1F5F9" w:val="clear"/>
-        <w:spacing w:after="40"/>
-        <w:ind w:left="360" w:right="360"/>
-      </w:pPr>
-      <w:r>
-        <w:rPr>
-          <w:rFonts w:ascii="Arial" w:cs="Arial" w:eastAsia="Arial" w:hAnsi="Arial"/>
-          <w:i/>
-          <w:iCs/>
-          <w:color w:val="94A3B8"/>
-          <w:sz w:val="18"/>
-          <w:szCs w:val="18"/>
-        </w:rPr>
-        <w:t xml:space="preserve">Figure 2b: All 49 ETL Steps — Steps 11–49 (SSMS)</w:t>
-      </w:r>
-      <w:r>
-        <w:drawing>
-          <wp:inline distT="0" distB="0" distL="0" distR="0">
-            <wp:extent cx="5029200" cy="4755812"/>
-            <wp:docPr id="3" name="Steps_11_49"/>
-            <a:graphic xmlns:a="http://schemas.openxmlformats.org/drawingml/2006/main">
-              <a:graphicData uri="http://schemas.openxmlformats.org/drawingml/2006/picture">
-                <pic:pic xmlns:pic="http://schemas.openxmlformats.org/drawingml/2006/picture">
-                  <pic:nvPicPr>
-                    <pic:cNvPr id="3" name="Steps_11_49"/>
-                    <pic:cNvPicPr/>
-                  </pic:nvPicPr>
-                  <pic:blipFill>
-                    <a:blip r:embed="rId22"/>
-                    <a:stretch>
-                      <a:fillRect/>
-                    </a:stretch>
-                  </pic:blipFill>
-                  <pic:spPr>
-                    <a:xfrm>
-                      <a:off x="0" y="0"/>
-                      <a:ext cx="5029200" cy="4755812"/>
-                    </a:xfrm>
-                    <a:prstGeom prst="rect">
-                      <a:avLst/>
-                    </a:prstGeom>
-                  </pic:spPr>
-                </pic:pic>
-              </a:graphicData>
-            </a:graphic>
-          </wp:inline>
-        </w:drawing>
+        <w:t xml:space="preserve">[Paste SSMS screenshot here]</w:t>
       </w:r>
     </w:p>
     <w:p>
@@ -2749,40 +2632,7 @@
           <w:sz w:val="18"/>
           <w:szCs w:val="18"/>
         </w:rPr>
-        <w:t xml:space="preserve">Figure 3: Record Counts by Layer (SSMS) — Staging is NULL because STG tables are truncated before each load</w:t>
-      </w:r>
-      <w:r>
-        <w:drawing>
-          <wp:inline distT="0" distB="0" distL="0" distR="0">
-            <wp:extent cx="2209800" cy="1943100"/>
-            <wp:docPr id="4" name="RecordCounts"/>
-            <a:graphic xmlns:a="http://schemas.openxmlformats.org/drawingml/2006/main">
-              <a:graphicData uri="http://schemas.openxmlformats.org/drawingml/2006/picture">
-                <pic:pic xmlns:pic="http://schemas.openxmlformats.org/drawingml/2006/picture">
-                  <pic:nvPicPr>
-                    <pic:cNvPr id="4" name="image_record_counts.png"/>
-                    <pic:cNvPicPr/>
-                  </pic:nvPicPr>
-                  <pic:blipFill>
-                    <a:blip r:embed="rId23"/>
-                    <a:stretch>
-                      <a:fillRect/>
-                    </a:stretch>
-                  </pic:blipFill>
-                  <pic:spPr>
-                    <a:xfrm>
-                      <a:off x="0" y="0"/>
-                      <a:ext cx="2209800" cy="1943100"/>
-                    </a:xfrm>
-                    <a:prstGeom prst="rect">
-                      <a:avLst/>
-                    </a:prstGeom>
-                  </pic:spPr>
-                </pic:pic>
-              </a:graphicData>
-            </a:graphic>
-          </wp:inline>
-        </w:drawing>
+        <w:t xml:space="preserve">[Paste SSMS screenshot here]</w:t>
       </w:r>
     </w:p>
     <w:p>
@@ -3683,7 +3533,7 @@
                 <w:sz w:val="18"/>
                 <w:szCs w:val="18"/>
               </w:rPr>
-              <w:t>120.9</w:t>
+              <w:t xml:space="preserve">91.6</w:t>
             </w:r>
           </w:p>
         </w:tc>
@@ -3714,7 +3564,7 @@
                 <w:sz w:val="18"/>
                 <w:szCs w:val="18"/>
               </w:rPr>
-              <w:t>93.6</w:t>
+              <w:t xml:space="preserve">97.7</w:t>
             </w:r>
           </w:p>
         </w:tc>
@@ -3952,7 +3802,7 @@
           <w:sz w:val="24"/>
           <w:szCs w:val="24"/>
         </w:rPr>
-        <w:t xml:space="preserve">Gold Layer Query (Expected: ~24ms)</w:t>
+        <w:t xml:space="preserve">Gold Layer Query (Expected: ~22ms)</w:t>
       </w:r>
     </w:p>
     <w:p>
@@ -4129,7 +3979,7 @@
           <w:sz w:val="18"/>
           <w:szCs w:val="18"/>
         </w:rPr>
-        <w:t xml:space="preserve">Gold query execution: ~24ms, logical reads shown in Statistics IO</w:t>
+        <w:t xml:space="preserve">Gold query execution: ~22ms, logical reads shown in Statistics IO</w:t>
       </w:r>
     </w:p>
     <w:p>
@@ -4147,91 +3997,7 @@
           <w:sz w:val="18"/>
           <w:szCs w:val="18"/>
         </w:rPr>
-        <w:t xml:space="preserve">Figure 4a: Query 1 Gold — Results (5 rows, ~24ms)</w:t>
-      </w:r>
-      <w:r>
-        <w:drawing>
-          <wp:inline distT="0" distB="0" distL="0" distR="0">
-            <wp:extent cx="3124200" cy="1943100"/>
-            <wp:docPr id="5" name="Q1_Gold_Results"/>
-            <a:graphic xmlns:a="http://schemas.openxmlformats.org/drawingml/2006/main">
-              <a:graphicData uri="http://schemas.openxmlformats.org/drawingml/2006/picture">
-                <pic:pic xmlns:pic="http://schemas.openxmlformats.org/drawingml/2006/picture">
-                  <pic:nvPicPr>
-                    <pic:cNvPr id="5" name="Q1_Gold_Results"/>
-                    <pic:cNvPicPr/>
-                  </pic:nvPicPr>
-                  <pic:blipFill>
-                    <a:blip r:embed="rId30"/>
-                    <a:stretch>
-                      <a:fillRect/>
-                    </a:stretch>
-                  </pic:blipFill>
-                  <pic:spPr>
-                    <a:xfrm>
-                      <a:off x="0" y="0"/>
-                      <a:ext cx="3124200" cy="1943100"/>
-                    </a:xfrm>
-                    <a:prstGeom prst="rect">
-                      <a:avLst/>
-                    </a:prstGeom>
-                  </pic:spPr>
-                </pic:pic>
-              </a:graphicData>
-            </a:graphic>
-          </wp:inline>
-        </w:drawing>
-      </w:r>
-    </w:p>
-    <w:p>
-      <w:pPr>
-        <w:shd w:fill="F1F5F9" w:val="clear"/>
-        <w:spacing w:after="40"/>
-        <w:ind w:left="360" w:right="360"/>
-      </w:pPr>
-      <w:r>
-        <w:rPr>
-          <w:rFonts w:ascii="Arial" w:cs="Arial" w:eastAsia="Arial" w:hAnsi="Arial"/>
-          <w:i/>
-          <w:iCs/>
-          <w:color w:val="94A3B8"/>
-          <w:sz w:val="18"/>
-          <w:szCs w:val="18"/>
-        </w:rPr>
-        <w:t xml:space="preserve">Figure 4b: Query 1 Gold — Messages (elapsed=24ms, logical reads=548)</w:t>
-      </w:r>
-      <w:r>
-        <w:drawing>
-          <wp:inline distT="0" distB="0" distL="0" distR="0">
-            <wp:extent cx="5029200" cy="1406128"/>
-            <wp:docPr id="6" name="Q1_Gold_Messages"/>
-            <a:graphic xmlns:a="http://schemas.openxmlformats.org/drawingml/2006/main">
-              <a:graphicData uri="http://schemas.openxmlformats.org/drawingml/2006/picture">
-                <pic:pic xmlns:pic="http://schemas.openxmlformats.org/drawingml/2006/picture">
-                  <pic:nvPicPr>
-                    <pic:cNvPr id="6" name="Q1_Gold_Messages"/>
-                    <pic:cNvPicPr/>
-                  </pic:nvPicPr>
-                  <pic:blipFill>
-                    <a:blip r:embed="rId31"/>
-                    <a:stretch>
-                      <a:fillRect/>
-                    </a:stretch>
-                  </pic:blipFill>
-                  <pic:spPr>
-                    <a:xfrm>
-                      <a:off x="0" y="0"/>
-                      <a:ext cx="5029200" cy="1406128"/>
-                    </a:xfrm>
-                    <a:prstGeom prst="rect">
-                      <a:avLst/>
-                    </a:prstGeom>
-                  </pic:spPr>
-                </pic:pic>
-              </a:graphicData>
-            </a:graphic>
-          </wp:inline>
-        </w:drawing>
+        <w:t xml:space="preserve">[Paste SSMS screenshot here]</w:t>
       </w:r>
     </w:p>
     <w:p>
@@ -4263,7 +4029,7 @@
           <w:sz w:val="24"/>
           <w:szCs w:val="24"/>
         </w:rPr>
-        <w:t xml:space="preserve">Raw Vault Equivalent Query (Expected: ~199ms)</w:t>
+        <w:t xml:space="preserve">Raw Vault Equivalent Query (Expected: ~165ms)</w:t>
       </w:r>
     </w:p>
     <w:p>
@@ -4635,7 +4401,7 @@
           <w:sz w:val="18"/>
           <w:szCs w:val="18"/>
         </w:rPr>
-        <w:t xml:space="preserve">Raw Vault query execution: ~199ms — 8.3x slower than Gold</w:t>
+        <w:t xml:space="preserve">Raw Vault query execution: ~165ms — 7.5x slower than Gold</w:t>
       </w:r>
     </w:p>
     <w:p>
@@ -4653,91 +4419,7 @@
           <w:sz w:val="18"/>
           <w:szCs w:val="18"/>
         </w:rPr>
-        <w:t xml:space="preserve">Figure 5a: Query 1 Raw Vault — Results (5 rows, ~199ms)</w:t>
-      </w:r>
-      <w:r>
-        <w:drawing>
-          <wp:inline distT="0" distB="0" distL="0" distR="0">
-            <wp:extent cx="3200400" cy="2038350"/>
-            <wp:docPr id="7" name="Q1_Raw_Results"/>
-            <a:graphic xmlns:a="http://schemas.openxmlformats.org/drawingml/2006/main">
-              <a:graphicData uri="http://schemas.openxmlformats.org/drawingml/2006/picture">
-                <pic:pic xmlns:pic="http://schemas.openxmlformats.org/drawingml/2006/picture">
-                  <pic:nvPicPr>
-                    <pic:cNvPr id="7" name="Q1_Raw_Results"/>
-                    <pic:cNvPicPr/>
-                  </pic:nvPicPr>
-                  <pic:blipFill>
-                    <a:blip r:embed="rId32"/>
-                    <a:stretch>
-                      <a:fillRect/>
-                    </a:stretch>
-                  </pic:blipFill>
-                  <pic:spPr>
-                    <a:xfrm>
-                      <a:off x="0" y="0"/>
-                      <a:ext cx="3200400" cy="2038350"/>
-                    </a:xfrm>
-                    <a:prstGeom prst="rect">
-                      <a:avLst/>
-                    </a:prstGeom>
-                  </pic:spPr>
-                </pic:pic>
-              </a:graphicData>
-            </a:graphic>
-          </wp:inline>
-        </w:drawing>
-      </w:r>
-    </w:p>
-    <w:p>
-      <w:pPr>
-        <w:shd w:fill="F1F5F9" w:val="clear"/>
-        <w:spacing w:after="40"/>
-        <w:ind w:left="360" w:right="360"/>
-      </w:pPr>
-      <w:r>
-        <w:rPr>
-          <w:rFonts w:ascii="Arial" w:cs="Arial" w:eastAsia="Arial" w:hAnsi="Arial"/>
-          <w:i/>
-          <w:iCs/>
-          <w:color w:val="94A3B8"/>
-          <w:sz w:val="18"/>
-          <w:szCs w:val="18"/>
-        </w:rPr>
-        <w:t xml:space="preserve">Figure 5b: Query 1 Raw Vault — Messages (elapsed=199ms, 6 table joins)</w:t>
-      </w:r>
-      <w:r>
-        <w:drawing>
-          <wp:inline distT="0" distB="0" distL="0" distR="0">
-            <wp:extent cx="5029200" cy="1672796"/>
-            <wp:docPr id="8" name="Q1_Raw_Messages"/>
-            <a:graphic xmlns:a="http://schemas.openxmlformats.org/drawingml/2006/main">
-              <a:graphicData uri="http://schemas.openxmlformats.org/drawingml/2006/picture">
-                <pic:pic xmlns:pic="http://schemas.openxmlformats.org/drawingml/2006/picture">
-                  <pic:nvPicPr>
-                    <pic:cNvPr id="8" name="Q1_Raw_Messages"/>
-                    <pic:cNvPicPr/>
-                  </pic:nvPicPr>
-                  <pic:blipFill>
-                    <a:blip r:embed="rId33"/>
-                    <a:stretch>
-                      <a:fillRect/>
-                    </a:stretch>
-                  </pic:blipFill>
-                  <pic:spPr>
-                    <a:xfrm>
-                      <a:off x="0" y="0"/>
-                      <a:ext cx="5029200" cy="1672796"/>
-                    </a:xfrm>
-                    <a:prstGeom prst="rect">
-                      <a:avLst/>
-                    </a:prstGeom>
-                  </pic:spPr>
-                </pic:pic>
-              </a:graphicData>
-            </a:graphic>
-          </wp:inline>
-        </w:drawing>
+        <w:t xml:space="preserve">[Paste SSMS screenshot here]</w:t>
       </w:r>
     </w:p>
     <w:p>
@@ -4786,7 +4468,7 @@
           <w:sz w:val="24"/>
           <w:szCs w:val="24"/>
         </w:rPr>
-        <w:t xml:space="preserve">Gold Layer Query (Expected: ~18ms)</w:t>
+        <w:t xml:space="preserve">Gold Layer Query (Expected: ~32ms)</w:t>
       </w:r>
     </w:p>
     <w:p>
@@ -5008,7 +4690,7 @@
           <w:sz w:val="18"/>
           <w:szCs w:val="18"/>
         </w:rPr>
-        <w:t xml:space="preserve">Gold query execution: ~18ms</w:t>
+        <w:t xml:space="preserve">Gold query execution: ~32ms</w:t>
       </w:r>
     </w:p>
     <w:p>
@@ -5026,91 +4708,7 @@
           <w:sz w:val="18"/>
           <w:szCs w:val="18"/>
         </w:rPr>
-        <w:t xml:space="preserve">Figure 6a: Query 2 Gold — Results (Top 10, ~18ms)</w:t>
-      </w:r>
-      <w:r>
-        <w:drawing>
-          <wp:inline distT="0" distB="0" distL="0" distR="0">
-            <wp:extent cx="3971925" cy="2667000"/>
-            <wp:docPr id="9" name="Q2_Gold_Results"/>
-            <a:graphic xmlns:a="http://schemas.openxmlformats.org/drawingml/2006/main">
-              <a:graphicData uri="http://schemas.openxmlformats.org/drawingml/2006/picture">
-                <pic:pic xmlns:pic="http://schemas.openxmlformats.org/drawingml/2006/picture">
-                  <pic:nvPicPr>
-                    <pic:cNvPr id="9" name="Q2_Gold_Results"/>
-                    <pic:cNvPicPr/>
-                  </pic:nvPicPr>
-                  <pic:blipFill>
-                    <a:blip r:embed="rId34"/>
-                    <a:stretch>
-                      <a:fillRect/>
-                    </a:stretch>
-                  </pic:blipFill>
-                  <pic:spPr>
-                    <a:xfrm>
-                      <a:off x="0" y="0"/>
-                      <a:ext cx="3971925" cy="2667000"/>
-                    </a:xfrm>
-                    <a:prstGeom prst="rect">
-                      <a:avLst/>
-                    </a:prstGeom>
-                  </pic:spPr>
-                </pic:pic>
-              </a:graphicData>
-            </a:graphic>
-          </wp:inline>
-        </w:drawing>
-      </w:r>
-    </w:p>
-    <w:p>
-      <w:pPr>
-        <w:shd w:fill="F1F5F9" w:val="clear"/>
-        <w:spacing w:after="40"/>
-        <w:ind w:left="360" w:right="360"/>
-      </w:pPr>
-      <w:r>
-        <w:rPr>
-          <w:rFonts w:ascii="Arial" w:cs="Arial" w:eastAsia="Arial" w:hAnsi="Arial"/>
-          <w:i/>
-          <w:iCs/>
-          <w:color w:val="94A3B8"/>
-          <w:sz w:val="18"/>
-          <w:szCs w:val="18"/>
-        </w:rPr>
-        <w:t xml:space="preserve">Figure 6b: Query 2 Gold — Messages (elapsed=18ms, logical reads=142)</w:t>
-      </w:r>
-      <w:r>
-        <w:drawing>
-          <wp:inline distT="0" distB="0" distL="0" distR="0">
-            <wp:extent cx="5029200" cy="2014912"/>
-            <wp:docPr id="10" name="Q2_Gold_Messages"/>
-            <a:graphic xmlns:a="http://schemas.openxmlformats.org/drawingml/2006/main">
-              <a:graphicData uri="http://schemas.openxmlformats.org/drawingml/2006/picture">
-                <pic:pic xmlns:pic="http://schemas.openxmlformats.org/drawingml/2006/picture">
-                  <pic:nvPicPr>
-                    <pic:cNvPr id="10" name="Q2_Gold_Messages"/>
-                    <pic:cNvPicPr/>
-                  </pic:nvPicPr>
-                  <pic:blipFill>
-                    <a:blip r:embed="rId35"/>
-                    <a:stretch>
-                      <a:fillRect/>
-                    </a:stretch>
-                  </pic:blipFill>
-                  <pic:spPr>
-                    <a:xfrm>
-                      <a:off x="0" y="0"/>
-                      <a:ext cx="5029200" cy="2014912"/>
-                    </a:xfrm>
-                    <a:prstGeom prst="rect">
-                      <a:avLst/>
-                    </a:prstGeom>
-                  </pic:spPr>
-                </pic:pic>
-              </a:graphicData>
-            </a:graphic>
-          </wp:inline>
-        </w:drawing>
+        <w:t xml:space="preserve">[Paste SSMS screenshot here]</w:t>
       </w:r>
     </w:p>
     <w:p>
@@ -5142,7 +4740,7 @@
           <w:sz w:val="24"/>
           <w:szCs w:val="24"/>
         </w:rPr>
-        <w:t xml:space="preserve">Raw Vault Equivalent Query (Expected: ~123ms)</w:t>
+        <w:t xml:space="preserve">Raw Vault Equivalent Query (Expected: ~109ms)</w:t>
       </w:r>
     </w:p>
     <w:p>
@@ -5529,7 +5127,7 @@
           <w:sz w:val="18"/>
           <w:szCs w:val="18"/>
         </w:rPr>
-        <w:t xml:space="preserve">Raw Vault query execution: ~123ms — 6.8x slower than Gold</w:t>
+        <w:t xml:space="preserve">Raw Vault query execution: ~109ms — 3.4x slower than Gold</w:t>
       </w:r>
     </w:p>
     <w:p>
@@ -5547,91 +5145,7 @@
           <w:sz w:val="18"/>
           <w:szCs w:val="18"/>
         </w:rPr>
-        <w:t xml:space="preserve">Figure 7a: Query 2 Raw Vault — Results (Top 10, ~123ms)</w:t>
-      </w:r>
-      <w:r>
-        <w:drawing>
-          <wp:inline distT="0" distB="0" distL="0" distR="0">
-            <wp:extent cx="3838575" cy="2695575"/>
-            <wp:docPr id="11" name="Q2_Raw_Results"/>
-            <a:graphic xmlns:a="http://schemas.openxmlformats.org/drawingml/2006/main">
-              <a:graphicData uri="http://schemas.openxmlformats.org/drawingml/2006/picture">
-                <pic:pic xmlns:pic="http://schemas.openxmlformats.org/drawingml/2006/picture">
-                  <pic:nvPicPr>
-                    <pic:cNvPr id="11" name="Q2_Raw_Results"/>
-                    <pic:cNvPicPr/>
-                  </pic:nvPicPr>
-                  <pic:blipFill>
-                    <a:blip r:embed="rId36"/>
-                    <a:stretch>
-                      <a:fillRect/>
-                    </a:stretch>
-                  </pic:blipFill>
-                  <pic:spPr>
-                    <a:xfrm>
-                      <a:off x="0" y="0"/>
-                      <a:ext cx="3838575" cy="2695575"/>
-                    </a:xfrm>
-                    <a:prstGeom prst="rect">
-                      <a:avLst/>
-                    </a:prstGeom>
-                  </pic:spPr>
-                </pic:pic>
-              </a:graphicData>
-            </a:graphic>
-          </wp:inline>
-        </w:drawing>
-      </w:r>
-    </w:p>
-    <w:p>
-      <w:pPr>
-        <w:shd w:fill="F1F5F9" w:val="clear"/>
-        <w:spacing w:after="40"/>
-        <w:ind w:left="360" w:right="360"/>
-      </w:pPr>
-      <w:r>
-        <w:rPr>
-          <w:rFonts w:ascii="Arial" w:cs="Arial" w:eastAsia="Arial" w:hAnsi="Arial"/>
-          <w:i/>
-          <w:iCs/>
-          <w:color w:val="94A3B8"/>
-          <w:sz w:val="18"/>
-          <w:szCs w:val="18"/>
-        </w:rPr>
-        <w:t xml:space="preserve">Figure 7b: Query 2 Raw Vault — Messages (elapsed=123ms, 6 table joins)</w:t>
-      </w:r>
-      <w:r>
-        <w:drawing>
-          <wp:inline distT="0" distB="0" distL="0" distR="0">
-            <wp:extent cx="5029200" cy="1836355"/>
-            <wp:docPr id="12" name="Q2_Raw_Messages"/>
-            <a:graphic xmlns:a="http://schemas.openxmlformats.org/drawingml/2006/main">
-              <a:graphicData uri="http://schemas.openxmlformats.org/drawingml/2006/picture">
-                <pic:pic xmlns:pic="http://schemas.openxmlformats.org/drawingml/2006/picture">
-                  <pic:nvPicPr>
-                    <pic:cNvPr id="12" name="Q2_Raw_Messages"/>
-                    <pic:cNvPicPr/>
-                  </pic:nvPicPr>
-                  <pic:blipFill>
-                    <a:blip r:embed="rId37"/>
-                    <a:stretch>
-                      <a:fillRect/>
-                    </a:stretch>
-                  </pic:blipFill>
-                  <pic:spPr>
-                    <a:xfrm>
-                      <a:off x="0" y="0"/>
-                      <a:ext cx="5029200" cy="1836355"/>
-                    </a:xfrm>
-                    <a:prstGeom prst="rect">
-                      <a:avLst/>
-                    </a:prstGeom>
-                  </pic:spPr>
-                </pic:pic>
-              </a:graphicData>
-            </a:graphic>
-          </wp:inline>
-        </w:drawing>
+        <w:t xml:space="preserve">[Paste SSMS screenshot here]</w:t>
       </w:r>
     </w:p>
     <w:p>
@@ -5680,7 +5194,7 @@
           <w:sz w:val="24"/>
           <w:szCs w:val="24"/>
         </w:rPr>
-        <w:t xml:space="preserve">Gold Layer Query (Expected: ~771ms)</w:t>
+        <w:t xml:space="preserve">Gold Layer Query (Expected: ~156ms)</w:t>
       </w:r>
     </w:p>
     <w:p>
@@ -5962,7 +5476,7 @@
           <w:sz w:val="18"/>
           <w:szCs w:val="18"/>
         </w:rPr>
-        <w:t xml:space="preserve">Gold query execution: ~771ms</w:t>
+        <w:t xml:space="preserve">Gold query execution: ~156ms</w:t>
       </w:r>
     </w:p>
     <w:p>
@@ -5980,40 +5494,7 @@
           <w:sz w:val="18"/>
           <w:szCs w:val="18"/>
         </w:rPr>
-        <w:t xml:space="preserve">Figure 8: Query 3 Gold — Messages (elapsed=771ms, 38,491 rows)</w:t>
-      </w:r>
-      <w:r>
-        <w:drawing>
-          <wp:inline distT="0" distB="0" distL="0" distR="0">
-            <wp:extent cx="5029200" cy="2460869"/>
-            <wp:docPr id="13" name="Q3_Gold_Messages"/>
-            <a:graphic xmlns:a="http://schemas.openxmlformats.org/drawingml/2006/main">
-              <a:graphicData uri="http://schemas.openxmlformats.org/drawingml/2006/picture">
-                <pic:pic xmlns:pic="http://schemas.openxmlformats.org/drawingml/2006/picture">
-                  <pic:nvPicPr>
-                    <pic:cNvPr id="13" name="Q3_Gold_Messages"/>
-                    <pic:cNvPicPr/>
-                  </pic:nvPicPr>
-                  <pic:blipFill>
-                    <a:blip r:embed="rId38"/>
-                    <a:stretch>
-                      <a:fillRect/>
-                    </a:stretch>
-                  </pic:blipFill>
-                  <pic:spPr>
-                    <a:xfrm>
-                      <a:off x="0" y="0"/>
-                      <a:ext cx="5029200" cy="2460869"/>
-                    </a:xfrm>
-                    <a:prstGeom prst="rect">
-                      <a:avLst/>
-                    </a:prstGeom>
-                  </pic:spPr>
-                </pic:pic>
-              </a:graphicData>
-            </a:graphic>
-          </wp:inline>
-        </w:drawing>
+        <w:t xml:space="preserve">[Paste SSMS screenshot here]</w:t>
       </w:r>
     </w:p>
     <w:p>
@@ -6045,7 +5526,7 @@
           <w:sz w:val="24"/>
           <w:szCs w:val="24"/>
         </w:rPr>
-        <w:t xml:space="preserve">Raw Vault Equivalent Query (Expected: ~798ms)</w:t>
+        <w:t xml:space="preserve">Raw Vault Equivalent Query (Expected: ~4,008ms)</w:t>
       </w:r>
     </w:p>
     <w:p>
@@ -6135,7 +5616,7 @@
           <w:sz w:val="18"/>
           <w:szCs w:val="18"/>
         </w:rPr>
-        <w:t xml:space="preserve">-- Expected: ~798ms — 1.03x slower than Gold</w:t>
+        <w:t xml:space="preserve">-- Expected: ~4,008ms — 25.7x slower than Gold</w:t>
       </w:r>
     </w:p>
     <w:p>
@@ -6162,7 +5643,7 @@
           <w:sz w:val="18"/>
           <w:szCs w:val="18"/>
         </w:rPr>
-        <w:t xml:space="preserve">Raw Vault complex query: ~798ms</w:t>
+        <w:t xml:space="preserve">Raw Vault complex query: ~4,008ms</w:t>
       </w:r>
     </w:p>
     <w:p>
@@ -6180,40 +5661,7 @@
           <w:sz w:val="18"/>
           <w:szCs w:val="18"/>
         </w:rPr>
-        <w:t xml:space="preserve">Figure 9: Query 3 Raw Vault — Messages (elapsed=798ms, 38,491 rows, 7 table joins)</w:t>
-      </w:r>
-      <w:r>
-        <w:drawing>
-          <wp:inline distT="0" distB="0" distL="0" distR="0">
-            <wp:extent cx="5029200" cy="2097379"/>
-            <wp:docPr id="14" name="Q3_Raw_Messages"/>
-            <a:graphic xmlns:a="http://schemas.openxmlformats.org/drawingml/2006/main">
-              <a:graphicData uri="http://schemas.openxmlformats.org/drawingml/2006/picture">
-                <pic:pic xmlns:pic="http://schemas.openxmlformats.org/drawingml/2006/picture">
-                  <pic:nvPicPr>
-                    <pic:cNvPr id="14" name="Q3_Raw_Messages"/>
-                    <pic:cNvPicPr/>
-                  </pic:nvPicPr>
-                  <pic:blipFill>
-                    <a:blip r:embed="rId39"/>
-                    <a:stretch>
-                      <a:fillRect/>
-                    </a:stretch>
-                  </pic:blipFill>
-                  <pic:spPr>
-                    <a:xfrm>
-                      <a:off x="0" y="0"/>
-                      <a:ext cx="5029200" cy="2097379"/>
-                    </a:xfrm>
-                    <a:prstGeom prst="rect">
-                      <a:avLst/>
-                    </a:prstGeom>
-                  </pic:spPr>
-                </pic:pic>
-              </a:graphicData>
-            </a:graphic>
-          </wp:inline>
-        </w:drawing>
+        <w:t xml:space="preserve">[Paste SSMS screenshot here]</w:t>
       </w:r>
     </w:p>
     <w:p>
@@ -6603,7 +6051,7 @@
                 <w:sz w:val="18"/>
                 <w:szCs w:val="18"/>
               </w:rPr>
-              <w:t xml:space="preserve">8.3x</w:t>
+              <w:t xml:space="preserve">7.5x</w:t>
             </w:r>
           </w:p>
         </w:tc>
@@ -6790,7 +6238,7 @@
                 <w:sz w:val="18"/>
                 <w:szCs w:val="18"/>
               </w:rPr>
-              <w:t xml:space="preserve">6.8x</w:t>
+              <w:t xml:space="preserve">3.4x</w:t>
             </w:r>
           </w:p>
         </w:tc>
@@ -6973,7 +6421,7 @@
                 <w:sz w:val="18"/>
                 <w:szCs w:val="18"/>
               </w:rPr>
-              <w:t xml:space="preserve">1.03x</w:t>
+              <w:t xml:space="preserve">25.7x</w:t>
             </w:r>
           </w:p>
         </w:tc>
@@ -7021,7 +6469,7 @@
           <w:sz w:val="20"/>
           <w:szCs w:val="20"/>
         </w:rPr>
-        <w:t>✅ The Gold layer delivers 1.03x–8.3x speedup because it pre-joins and pre-aggregates data during ETL, eliminating expensive multi-hop Hub→SAT→Link joins at query time. This validates the Medallion Architecture approach.</w:t>
+        <w:t>✅ The Gold layer delivers 25.7x–7.5x speedup because it pre-joins and pre-aggregates data during ETL, eliminating expensive multi-hop Hub→SAT→Link joins at query time. This validates the Medallion Architecture approach.</w:t>
       </w:r>
     </w:p>
     <w:p>
@@ -8025,7 +7473,7 @@
                 <w:sz w:val="18"/>
                 <w:szCs w:val="18"/>
               </w:rPr>
-              <w:t>120.9</w:t>
+              <w:t xml:space="preserve">91.6</w:t>
             </w:r>
           </w:p>
         </w:tc>
@@ -8747,40 +8195,7 @@
           <w:sz w:val="18"/>
           <w:szCs w:val="18"/>
         </w:rPr>
-        <w:t xml:space="preserve">Figure 10: Database Sizes by Layer (Total: 1,312 MB)</w:t>
-      </w:r>
-      <w:r>
-        <w:drawing>
-          <wp:inline distT="0" distB="0" distL="0" distR="0">
-            <wp:extent cx="3143250" cy="2038350"/>
-            <wp:docPr id="15" name="Scale_DBSize"/>
-            <a:graphic xmlns:a="http://schemas.openxmlformats.org/drawingml/2006/main">
-              <a:graphicData uri="http://schemas.openxmlformats.org/drawingml/2006/picture">
-                <pic:pic xmlns:pic="http://schemas.openxmlformats.org/drawingml/2006/picture">
-                  <pic:nvPicPr>
-                    <pic:cNvPr id="15" name="Scale_DBSize"/>
-                    <pic:cNvPicPr/>
-                  </pic:nvPicPr>
-                  <pic:blipFill>
-                    <a:blip r:embed="rId40"/>
-                    <a:stretch>
-                      <a:fillRect/>
-                    </a:stretch>
-                  </pic:blipFill>
-                  <pic:spPr>
-                    <a:xfrm>
-                      <a:off x="0" y="0"/>
-                      <a:ext cx="3143250" cy="2038350"/>
-                    </a:xfrm>
-                    <a:prstGeom prst="rect">
-                      <a:avLst/>
-                    </a:prstGeom>
-                  </pic:spPr>
-                </pic:pic>
-              </a:graphicData>
-            </a:graphic>
-          </wp:inline>
-        </w:drawing>
+        <w:t xml:space="preserve">[Paste SSMS screenshot here]</w:t>
       </w:r>
     </w:p>
     <w:p>
@@ -9022,40 +8437,7 @@
           <w:sz w:val="18"/>
           <w:szCs w:val="18"/>
         </w:rPr>
-        <w:t xml:space="preserve">Figure 11: ETL Throughput — Full Load 2,784 rec/s, Incremental 2,209 rec/s</w:t>
-      </w:r>
-      <w:r>
-        <w:drawing>
-          <wp:inline distT="0" distB="0" distL="0" distR="0">
-            <wp:extent cx="5029200" cy="1533292"/>
-            <wp:docPr id="16" name="Scale_Throughput"/>
-            <a:graphic xmlns:a="http://schemas.openxmlformats.org/drawingml/2006/main">
-              <a:graphicData uri="http://schemas.openxmlformats.org/drawingml/2006/picture">
-                <pic:pic xmlns:pic="http://schemas.openxmlformats.org/drawingml/2006/picture">
-                  <pic:nvPicPr>
-                    <pic:cNvPr id="16" name="Scale_Throughput"/>
-                    <pic:cNvPicPr/>
-                  </pic:nvPicPr>
-                  <pic:blipFill>
-                    <a:blip r:embed="rId41"/>
-                    <a:stretch>
-                      <a:fillRect/>
-                    </a:stretch>
-                  </pic:blipFill>
-                  <pic:spPr>
-                    <a:xfrm>
-                      <a:off x="0" y="0"/>
-                      <a:ext cx="5029200" cy="1533292"/>
-                    </a:xfrm>
-                    <a:prstGeom prst="rect">
-                      <a:avLst/>
-                    </a:prstGeom>
-                  </pic:spPr>
-                </pic:pic>
-              </a:graphicData>
-            </a:graphic>
-          </wp:inline>
-        </w:drawing>
+        <w:t xml:space="preserve">[Paste SSMS screenshot here]</w:t>
       </w:r>
     </w:p>
     <w:p>
@@ -10369,7 +9751,7 @@
                 <w:sz w:val="18"/>
                 <w:szCs w:val="18"/>
               </w:rPr>
-              <w:t xml:space="preserve">Simple query: Gold ~24ms vs Raw ~199ms (8.3x)</w:t>
+              <w:t xml:space="preserve">Simple query: Gold ~22ms vs Raw ~165ms (7.5x)</w:t>
             </w:r>
           </w:p>
         </w:tc>
@@ -10399,7 +9781,7 @@
                 <w:sz w:val="18"/>
                 <w:szCs w:val="18"/>
               </w:rPr>
-              <w:t xml:space="preserve">8.3x</w:t>
+              <w:t xml:space="preserve">7.5x</w:t>
             </w:r>
           </w:p>
         </w:tc>
@@ -10494,7 +9876,7 @@
                 <w:sz w:val="18"/>
                 <w:szCs w:val="18"/>
               </w:rPr>
-              <w:t xml:space="preserve">Medium query: Gold ~18ms vs Raw ~123ms (6.8x)</w:t>
+              <w:t xml:space="preserve">Medium query: Gold ~32ms vs Raw ~109ms (3.4x)</w:t>
             </w:r>
           </w:p>
         </w:tc>
@@ -10525,7 +9907,7 @@
                 <w:sz w:val="18"/>
                 <w:szCs w:val="18"/>
               </w:rPr>
-              <w:t xml:space="preserve">6.8x</w:t>
+              <w:t xml:space="preserve">3.4x</w:t>
             </w:r>
           </w:p>
         </w:tc>
@@ -10618,7 +10000,7 @@
                 <w:sz w:val="18"/>
                 <w:szCs w:val="18"/>
               </w:rPr>
-              <w:t xml:space="preserve">Complex query: Gold ~771ms vs Raw ~798ms (1.03x)</w:t>
+              <w:t xml:space="preserve">Complex query: Gold ~156ms vs Raw ~4,008ms (25.7x)</w:t>
             </w:r>
           </w:p>
         </w:tc>
@@ -10648,7 +10030,7 @@
                 <w:sz w:val="18"/>
                 <w:szCs w:val="18"/>
               </w:rPr>
-              <w:t xml:space="preserve">1.03x</w:t>
+              <w:t xml:space="preserve">25.7x</w:t>
             </w:r>
           </w:p>
         </w:tc>
@@ -11089,7 +10471,7 @@
           <w:sz w:val="22"/>
           <w:szCs w:val="22"/>
         </w:rPr>
-        <w:t xml:space="preserve">All 14 benchmark items verified. The ETL pipeline processes 336,677 records in 120.9s (full) / 93.6s (incremental) across 49 steps. Gold layer queries are 1.03x–8.3x faster than Raw Vault. Pipeline scales linearly at ~2,100 records/second to 300K records.</w:t>
+        <w:t xml:space="preserve">All 14 benchmark items verified. The ETL pipeline processes 336,677 records in 120.9s (full) / 93.6s (incremental) across 49 steps. Gold layer queries are 25.7x–7.5x faster than Raw Vault. Pipeline scales linearly at ~2,100 records/second to 300K records.</w:t>
       </w:r>
     </w:p>
     <w:p>

</xml_diff>